<commit_message>
added readme and pdf
</commit_message>
<xml_diff>
--- a/final_project_report.docx
+++ b/final_project_report.docx
@@ -167,7 +167,6 @@
                 <v:path gradientshapeok="t" o:connecttype="rect"/>
               </v:shapetype>
               <v:shape id="Text Box 1" o:spid="_x0000_s1026" type="#_x0000_t202" style="position:absolute;margin-left:.75pt;margin-top:-1in;width:594.75pt;height:60.75pt;z-index:251659264;visibility:visible;mso-wrap-style:square;mso-width-percent:0;mso-height-percent:0;mso-wrap-distance-left:9pt;mso-wrap-distance-top:0;mso-wrap-distance-right:9pt;mso-wrap-distance-bottom:0;mso-position-horizontal:absolute;mso-position-horizontal-relative:page;mso-position-vertical:absolute;mso-position-vertical-relative:text;mso-width-percent:0;mso-height-percent:0;mso-width-relative:margin;mso-height-relative:margin;v-text-anchor:top" o:gfxdata="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" filled="f" stroked="f">
-                <v:fill o:detectmouseclick="t"/>
                 <v:textbox>
                   <w:txbxContent>
                     <w:p>
@@ -387,14 +386,7 @@
           <w:rFonts w:ascii="Arial" w:hAnsi="Arial" w:cs="Arial"/>
           <w:lang w:val="en-US"/>
         </w:rPr>
-        <w:t>As noise is a fundamental issue with NISQ devices, error mitigation is necessary. Classical methods like quantum error correction would require the addition of additional qubits and syndrome decoding, and these are inefficient and in practice at large scale</w:t>
-      </w:r>
-      <w:r>
-        <w:rPr>
-          <w:rFonts w:ascii="Arial" w:hAnsi="Arial" w:cs="Arial"/>
-          <w:lang w:val="en-US"/>
-        </w:rPr>
-        <w:t>.</w:t>
+        <w:t>As noise is a fundamental issue with NISQ devices, error mitigation is necessary. Classical methods like quantum error correction would require the addition of additional qubits and syndrome decoding, and these are inefficient and in practice at large scale.</w:t>
       </w:r>
       <w:r>
         <w:rPr>
@@ -488,30 +480,13 @@
         <w:rPr>
           <w:rFonts w:ascii="Arial" w:hAnsi="Arial" w:cs="Arial"/>
         </w:rPr>
-        <w:t>We randomly generate quantum circuits with 5 qubits from the Cirq</w:t>
-      </w:r>
-      <w:r>
-        <w:rPr>
-          <w:rFonts w:ascii="Arial" w:hAnsi="Arial" w:cs="Arial"/>
-        </w:rPr>
-        <w:t xml:space="preserve"> </w:t>
-      </w:r>
-      <w:r>
-        <w:rPr>
-          <w:rFonts w:ascii="Arial" w:hAnsi="Arial" w:cs="Arial"/>
-        </w:rPr>
-        <w:t>library. The circuits are </w:t>
+        <w:t>We randomly generate quantum circuits with 5 qubits from the Cirq library. The circuits are </w:t>
       </w:r>
       <w:r>
         <w:rPr>
           <w:rFonts w:ascii="Arial" w:hAnsi="Arial" w:cs="Arial"/>
         </w:rPr>
         <w:br/>
-      </w:r>
-      <w:r>
-        <w:rPr>
-          <w:rFonts w:ascii="Arial" w:hAnsi="Arial" w:cs="Arial"/>
-        </w:rPr>
         <w:t>random single-qubit and two-qubit gate sequences (X, Y, Z, H, T, S, RX, RY, RZ, CNOT, CZ, SWAP). The depth of each circuit is randomly chosen between 6 and 9 layers.</w:t>
       </w:r>
       <w:r>
@@ -945,79 +920,7 @@
           <w:bCs/>
         </w:rPr>
         <w:lastRenderedPageBreak/>
-        <w:t xml:space="preserve">                                  </w:t>
-      </w:r>
-      <w:r>
-        <w:rPr>
-          <w:rFonts w:ascii="Arial" w:hAnsi="Arial" w:cs="Arial"/>
-          <w:b/>
-          <w:bCs/>
-        </w:rPr>
-        <w:t>L = MSE</w:t>
-      </w:r>
-      <w:r>
-        <w:rPr>
-          <w:rFonts w:ascii="Arial" w:hAnsi="Arial" w:cs="Arial"/>
-          <w:b/>
-          <w:bCs/>
-        </w:rPr>
-        <w:t xml:space="preserve"> </w:t>
-      </w:r>
-      <w:r>
-        <w:rPr>
-          <w:rFonts w:ascii="Arial" w:hAnsi="Arial" w:cs="Arial"/>
-          <w:b/>
-          <w:bCs/>
-        </w:rPr>
-        <w:t>(Y, Ŷ) + λ</w:t>
-      </w:r>
-      <w:r>
-        <w:rPr>
-          <w:rFonts w:ascii="Arial" w:hAnsi="Arial" w:cs="Arial"/>
-          <w:b/>
-          <w:bCs/>
-        </w:rPr>
-        <w:t xml:space="preserve"> </w:t>
-      </w:r>
-      <w:r>
-        <w:rPr>
-          <w:rFonts w:ascii="Arial" w:hAnsi="Arial" w:cs="Arial"/>
-          <w:b/>
-          <w:bCs/>
-        </w:rPr>
-        <w:t xml:space="preserve">(1 </w:t>
-      </w:r>
-      <w:r>
-        <w:rPr>
-          <w:rFonts w:ascii="Arial" w:hAnsi="Arial" w:cs="Arial"/>
-          <w:b/>
-          <w:bCs/>
-        </w:rPr>
-        <w:t>–</w:t>
-      </w:r>
-      <w:r>
-        <w:rPr>
-          <w:rFonts w:ascii="Arial" w:hAnsi="Arial" w:cs="Arial"/>
-          <w:b/>
-          <w:bCs/>
-        </w:rPr>
-        <w:t xml:space="preserve"> Fidelity</w:t>
-      </w:r>
-      <w:r>
-        <w:rPr>
-          <w:rFonts w:ascii="Arial" w:hAnsi="Arial" w:cs="Arial"/>
-          <w:b/>
-          <w:bCs/>
-        </w:rPr>
-        <w:t xml:space="preserve"> </w:t>
-      </w:r>
-      <w:r>
-        <w:rPr>
-          <w:rFonts w:ascii="Arial" w:hAnsi="Arial" w:cs="Arial"/>
-          <w:b/>
-          <w:bCs/>
-        </w:rPr>
-        <w:t>(Y, Ŷ))</w:t>
+        <w:t xml:space="preserve">                                  L = MSE (Y, Ŷ) + λ (1 – Fidelity (Y, Ŷ))</w:t>
       </w:r>
       <w:r>
         <w:rPr>
@@ -1057,30 +960,8 @@
         <w:rPr>
           <w:rFonts w:ascii="Arial" w:hAnsi="Arial" w:cs="Arial"/>
         </w:rPr>
-        <w:t xml:space="preserve">                                       </w:t>
-      </w:r>
-      <w:proofErr w:type="gramStart"/>
-      <w:r>
-        <w:rPr>
-          <w:rFonts w:ascii="Arial" w:hAnsi="Arial" w:cs="Arial"/>
-        </w:rPr>
-        <w:t>F(</w:t>
-      </w:r>
-      <w:proofErr w:type="gramEnd"/>
-      <w:r>
-        <w:rPr>
-          <w:rFonts w:ascii="Arial" w:hAnsi="Arial" w:cs="Arial"/>
-        </w:rPr>
-        <w:t xml:space="preserve">ρ, σ) ≈ </w:t>
-      </w:r>
-      <w:proofErr w:type="gramStart"/>
-      <w:r>
-        <w:rPr>
-          <w:rFonts w:ascii="Arial" w:hAnsi="Arial" w:cs="Arial"/>
-        </w:rPr>
-        <w:t>Re(</w:t>
-      </w:r>
-      <w:proofErr w:type="gramEnd"/>
+        <w:t xml:space="preserve">                                       F(ρ, σ) ≈ Re(</w:t>
+      </w:r>
       <w:r>
         <w:rPr>
           <w:rFonts w:ascii="Cambria Math" w:hAnsi="Cambria Math" w:cs="Cambria Math"/>
@@ -1125,27 +1006,34 @@
         <w:rPr>
           <w:rFonts w:ascii="Arial" w:hAnsi="Arial" w:cs="Arial"/>
         </w:rPr>
+        <w:t xml:space="preserve"> || · ||F</w:t>
+      </w:r>
+      <w:r>
+        <w:rPr>
+          <w:rFonts w:ascii="Arial" w:hAnsi="Arial" w:cs="Arial"/>
+        </w:rPr>
+        <w:t xml:space="preserve"> is the Frobenius norm</w:t>
+      </w:r>
+      <w:r>
+        <w:rPr>
+          <w:rFonts w:ascii="Arial" w:hAnsi="Arial" w:cs="Arial"/>
+        </w:rPr>
         <w:t xml:space="preserve"> </w:t>
       </w:r>
       <w:r>
         <w:rPr>
           <w:rFonts w:ascii="Arial" w:hAnsi="Arial" w:cs="Arial"/>
         </w:rPr>
-        <w:t>|| · ||F</w:t>
-      </w:r>
-      <w:r>
-        <w:rPr>
-          <w:rFonts w:ascii="Arial" w:hAnsi="Arial" w:cs="Arial"/>
-        </w:rPr>
-        <w:t xml:space="preserve"> is the Frobenius </w:t>
-      </w:r>
-      <w:proofErr w:type="gramStart"/>
-      <w:r>
-        <w:rPr>
-          <w:rFonts w:ascii="Arial" w:hAnsi="Arial" w:cs="Arial"/>
-        </w:rPr>
-        <w:t>norm</w:t>
-      </w:r>
+        <w:t xml:space="preserve">, and </w:t>
+      </w:r>
+      <w:proofErr w:type="spellStart"/>
+      <w:r>
+        <w:rPr>
+          <w:rFonts w:ascii="Arial" w:hAnsi="Arial" w:cs="Arial"/>
+        </w:rPr>
+        <w:t>i</w:t>
+      </w:r>
+      <w:proofErr w:type="spellEnd"/>
       <w:r>
         <w:rPr>
           <w:rFonts w:ascii="Arial" w:hAnsi="Arial" w:cs="Arial"/>
@@ -1154,54 +1042,41 @@
       </w:r>
       <w:r>
         <w:rPr>
-          <w:rFonts w:ascii="Arial" w:hAnsi="Arial" w:cs="Arial"/>
-        </w:rPr>
-        <w:t>,</w:t>
-      </w:r>
-      <w:proofErr w:type="gramEnd"/>
-      <w:r>
-        <w:rPr>
-          <w:rFonts w:ascii="Arial" w:hAnsi="Arial" w:cs="Arial"/>
-        </w:rPr>
-        <w:t xml:space="preserve"> and </w:t>
+          <w:rFonts w:ascii="Cambria Math" w:hAnsi="Cambria Math" w:cs="Cambria Math"/>
+        </w:rPr>
+        <w:t>⟨</w:t>
+      </w:r>
+      <w:r>
+        <w:rPr>
+          <w:rFonts w:ascii="Arial" w:hAnsi="Arial" w:cs="Arial"/>
+        </w:rPr>
+        <w:t xml:space="preserve">ρ, </w:t>
       </w:r>
       <w:proofErr w:type="spellStart"/>
       <w:r>
         <w:rPr>
           <w:rFonts w:ascii="Arial" w:hAnsi="Arial" w:cs="Arial"/>
         </w:rPr>
-        <w:t>i</w:t>
+        <w:t>σ</w:t>
+      </w:r>
+      <w:r>
+        <w:rPr>
+          <w:rFonts w:ascii="Cambria Math" w:hAnsi="Cambria Math" w:cs="Cambria Math"/>
+        </w:rPr>
+        <w:t>⟩</w:t>
+      </w:r>
+      <w:r>
+        <w:rPr>
+          <w:rFonts w:ascii="Arial" w:hAnsi="Arial" w:cs="Arial"/>
+        </w:rPr>
+        <w:t>s</w:t>
       </w:r>
       <w:proofErr w:type="spellEnd"/>
       <w:r>
         <w:rPr>
           <w:rFonts w:ascii="Arial" w:hAnsi="Arial" w:cs="Arial"/>
         </w:rPr>
-        <w:t xml:space="preserve"> </w:t>
-      </w:r>
-      <w:r>
-        <w:rPr>
-          <w:rFonts w:ascii="Cambria Math" w:hAnsi="Cambria Math" w:cs="Cambria Math"/>
-        </w:rPr>
-        <w:t>⟨</w:t>
-      </w:r>
-      <w:r>
-        <w:rPr>
-          <w:rFonts w:ascii="Arial" w:hAnsi="Arial" w:cs="Arial"/>
-        </w:rPr>
-        <w:t>ρ, σ</w:t>
-      </w:r>
-      <w:r>
-        <w:rPr>
-          <w:rFonts w:ascii="Cambria Math" w:hAnsi="Cambria Math" w:cs="Cambria Math"/>
-        </w:rPr>
-        <w:t>⟩</w:t>
-      </w:r>
-      <w:r>
-        <w:rPr>
-          <w:rFonts w:ascii="Arial" w:hAnsi="Arial" w:cs="Arial"/>
-        </w:rPr>
-        <w:t>s the element-wise complex inner product. This surrogate metric aligns well with fidelity trends while remaining differentiable and efficient.</w:t>
+        <w:t xml:space="preserve"> the element-wise complex inner product. This surrogate metric aligns well with fidelity trends while remaining differentiable and efficient.</w:t>
       </w:r>
     </w:p>
     <w:p>
@@ -1537,19 +1412,7 @@
         <w:rPr>
           <w:rFonts w:ascii="Arial" w:hAnsi="Arial" w:cs="Arial"/>
         </w:rPr>
-        <w:t xml:space="preserve">Czarnik et al. [1] have suggested an error mitigation technique through training noise models using classical simulations of Clifford circuits. </w:t>
-      </w:r>
-      <w:r>
-        <w:rPr>
-          <w:rFonts w:ascii="Arial" w:hAnsi="Arial" w:cs="Arial"/>
-        </w:rPr>
-        <w:t>There</w:t>
-      </w:r>
-      <w:r>
-        <w:rPr>
-          <w:rFonts w:ascii="Arial" w:hAnsi="Arial" w:cs="Arial"/>
-        </w:rPr>
-        <w:t xml:space="preserve"> is a method aiming at estimation and elimination of the effects of noise statistically rather than direct reconstruction of density matrices. While effective for specific gate sets, their approach does not generalize as well to generic quantum circuits as our CNN-based solution does, which is able to discover the underlying structure of quantum noise regardless of circuit content.</w:t>
+        <w:t>Czarnik et al. [1] have suggested an error mitigation technique through training noise models using classical simulations of Clifford circuits. There is a method aiming at estimation and elimination of the effects of noise statistically rather than direct reconstruction of density matrices. While effective for specific gate sets, their approach does not generalize as well to generic quantum circuits as our CNN-based solution does, which is able to discover the underlying structure of quantum noise regardless of circuit content.</w:t>
       </w:r>
     </w:p>
     <w:p>
@@ -1783,11 +1646,6 @@
           <w:rFonts w:ascii="Arial" w:hAnsi="Arial" w:cs="Arial"/>
         </w:rPr>
         <w:br/>
-      </w:r>
-      <w:r>
-        <w:rPr>
-          <w:rFonts w:ascii="Arial" w:hAnsi="Arial" w:cs="Arial"/>
-        </w:rPr>
         <w:t>Their approach demonstrates use of the variational circuits for error correction and has promising results for some noise models. Unfortunately, their application does require quantum resources for both the encoding and the correction. Our traditional CNN protocol performs as well or better without requiring more quantum resources for the correction step, making it directly applicable to current quantum hardware and more scalable for increasing system size.</w:t>
       </w:r>
     </w:p>
@@ -1846,6 +1704,7 @@
       <w:r>
         <w:rPr>
           <w:rFonts w:ascii="Arial" w:hAnsi="Arial" w:cs="Arial"/>
+          <w:noProof/>
         </w:rPr>
         <w:drawing>
           <wp:inline distT="0" distB="0" distL="0" distR="0" wp14:anchorId="0B38B3A1" wp14:editId="6D7EE340">
@@ -1911,21 +1770,7 @@
         <w:rPr>
           <w:rFonts w:ascii="Arial" w:hAnsi="Arial" w:cs="Arial"/>
         </w:rPr>
-        <w:t xml:space="preserve">The noise level-state fidelity relationship is approximately inversely dependent, such that the greater the noise level, the exponentially smaller the fidelity. This can be quantified by the </w:t>
-      </w:r>
-      <w:proofErr w:type="gramStart"/>
-      <w:r>
-        <w:rPr>
-          <w:rFonts w:ascii="Arial" w:hAnsi="Arial" w:cs="Arial"/>
-        </w:rPr>
-        <w:t>-0.55 correlation</w:t>
-      </w:r>
-      <w:proofErr w:type="gramEnd"/>
-      <w:r>
-        <w:rPr>
-          <w:rFonts w:ascii="Arial" w:hAnsi="Arial" w:cs="Arial"/>
-        </w:rPr>
-        <w:t xml:space="preserve"> coefficient of noise level-noisy fidelity in our correlation analysis below:</w:t>
+        <w:t>The noise level-state fidelity relationship is approximately inversely dependent, such that the greater the noise level, the exponentially smaller the fidelity. This can be quantified by the -0.55 correlation coefficient of noise level-noisy fidelity in our correlation analysis below:</w:t>
       </w:r>
       <w:r>
         <w:rPr>
@@ -1937,6 +1782,7 @@
       <w:r>
         <w:rPr>
           <w:rFonts w:ascii="Arial" w:hAnsi="Arial" w:cs="Arial"/>
+          <w:noProof/>
         </w:rPr>
         <w:drawing>
           <wp:inline distT="0" distB="0" distL="0" distR="0" wp14:anchorId="79E6405C" wp14:editId="67FDA943">
@@ -2186,19 +2032,7 @@
         <w:rPr>
           <w:rFonts w:ascii="Arial" w:hAnsi="Arial" w:cs="Arial"/>
         </w:rPr>
-        <w:t xml:space="preserve">Our testbed consisted of an end-to-end pipeline for simulating synthetic quantum data, training the CNN model, and evaluating its performance across different noise regimes. We used the Cirq quantum computing library to implement the circuit simulation and TensorFlow for </w:t>
-      </w:r>
-      <w:r>
-        <w:rPr>
-          <w:rFonts w:ascii="Arial" w:hAnsi="Arial" w:cs="Arial"/>
-        </w:rPr>
-        <w:t>modelling</w:t>
-      </w:r>
-      <w:r>
-        <w:rPr>
-          <w:rFonts w:ascii="Arial" w:hAnsi="Arial" w:cs="Arial"/>
-        </w:rPr>
-        <w:t xml:space="preserve"> the neural network.</w:t>
+        <w:t>Our testbed consisted of an end-to-end pipeline for simulating synthetic quantum data, training the CNN model, and evaluating its performance across different noise regimes. We used the Cirq quantum computing library to implement the circuit simulation and TensorFlow for modelling the neural network.</w:t>
       </w:r>
     </w:p>
     <w:p>
@@ -2254,6 +2088,7 @@
       <w:r>
         <w:rPr>
           <w:rFonts w:ascii="Arial" w:hAnsi="Arial" w:cs="Arial"/>
+          <w:noProof/>
         </w:rPr>
         <w:lastRenderedPageBreak/>
         <w:drawing>
@@ -2367,6 +2202,7 @@
       <w:r>
         <w:rPr>
           <w:rFonts w:ascii="Arial" w:hAnsi="Arial" w:cs="Arial"/>
+          <w:noProof/>
         </w:rPr>
         <w:drawing>
           <wp:inline distT="0" distB="0" distL="0" distR="0" wp14:anchorId="60E539B4" wp14:editId="45D47FC5">
@@ -2464,6 +2300,7 @@
       <w:r>
         <w:rPr>
           <w:rFonts w:ascii="Arial" w:hAnsi="Arial" w:cs="Arial"/>
+          <w:noProof/>
         </w:rPr>
         <w:lastRenderedPageBreak/>
         <w:drawing>
@@ -2562,6 +2399,7 @@
       <w:r>
         <w:rPr>
           <w:rFonts w:ascii="Arial" w:hAnsi="Arial" w:cs="Arial"/>
+          <w:noProof/>
         </w:rPr>
         <w:drawing>
           <wp:inline distT="0" distB="0" distL="0" distR="0" wp14:anchorId="69B71EF5" wp14:editId="5462081F">
@@ -2632,13 +2470,7 @@
         <w:rPr>
           <w:rFonts w:ascii="Arial" w:hAnsi="Arial" w:cs="Arial"/>
         </w:rPr>
-        <w:t>Mixed noise shows the highest corrected fidelity (0.807) and improvement (0.567)</w:t>
-      </w:r>
-      <w:r>
-        <w:rPr>
-          <w:rFonts w:ascii="Arial" w:hAnsi="Arial" w:cs="Arial"/>
-        </w:rPr>
-        <w:t>.</w:t>
+        <w:t>Mixed noise shows the highest corrected fidelity (0.807) and improvement (0.567).</w:t>
       </w:r>
     </w:p>
     <w:p>
@@ -2658,13 +2490,7 @@
         <w:rPr>
           <w:rFonts w:ascii="Arial" w:hAnsi="Arial" w:cs="Arial"/>
         </w:rPr>
-        <w:t>Phase damping shows the lowest improvement (0.241), despite starting with the highest noisy fidelity</w:t>
-      </w:r>
-      <w:r>
-        <w:rPr>
-          <w:rFonts w:ascii="Arial" w:hAnsi="Arial" w:cs="Arial"/>
-        </w:rPr>
-        <w:t>.</w:t>
+        <w:t>Phase damping shows the lowest improvement (0.241), despite starting with the highest noisy fidelity.</w:t>
       </w:r>
     </w:p>
     <w:p>
@@ -2684,13 +2510,7 @@
         <w:rPr>
           <w:rFonts w:ascii="Arial" w:hAnsi="Arial" w:cs="Arial"/>
         </w:rPr>
-        <w:t>Bit-flip noise demonstrates exceptional cases with improvements up to 0.84</w:t>
-      </w:r>
-      <w:r>
-        <w:rPr>
-          <w:rFonts w:ascii="Arial" w:hAnsi="Arial" w:cs="Arial"/>
-        </w:rPr>
-        <w:t>.</w:t>
+        <w:t>Bit-flip noise demonstrates exceptional cases with improvements up to 0.84.</w:t>
       </w:r>
     </w:p>
     <w:p>
@@ -2717,15 +2537,7 @@
           <w:b/>
           <w:bCs/>
         </w:rPr>
-        <w:t xml:space="preserve">3 </w:t>
-      </w:r>
-      <w:r>
-        <w:rPr>
-          <w:rFonts w:ascii="Arial" w:hAnsi="Arial" w:cs="Arial"/>
-          <w:b/>
-          <w:bCs/>
-        </w:rPr>
-        <w:t>Performance by Noise Level</w:t>
+        <w:t>3 Performance by Noise Level</w:t>
       </w:r>
     </w:p>
     <w:p>
@@ -2743,6 +2555,7 @@
           <w:rFonts w:ascii="Arial" w:hAnsi="Arial" w:cs="Arial"/>
           <w:b/>
           <w:bCs/>
+          <w:noProof/>
         </w:rPr>
         <w:drawing>
           <wp:inline distT="0" distB="0" distL="0" distR="0" wp14:anchorId="2DCB9109" wp14:editId="48022805">
@@ -2837,6 +2650,7 @@
           <w:rFonts w:ascii="Arial" w:hAnsi="Arial" w:cs="Arial"/>
           <w:b/>
           <w:bCs/>
+          <w:noProof/>
         </w:rPr>
         <w:drawing>
           <wp:inline distT="0" distB="0" distL="0" distR="0" wp14:anchorId="58B5339B" wp14:editId="3D6D3895">
@@ -2935,19 +2749,7 @@
         <w:rPr>
           <w:rFonts w:ascii="Arial" w:hAnsi="Arial" w:cs="Arial"/>
         </w:rPr>
-        <w:t xml:space="preserve">This work demonstrates the effectiveness of CNN-based quantum error correction in density matrix reconstruction. Our model provides high fidelity improvements on various types of noise and intensities, with extremely </w:t>
-      </w:r>
-      <w:r>
-        <w:rPr>
-          <w:rFonts w:ascii="Arial" w:hAnsi="Arial" w:cs="Arial"/>
-        </w:rPr>
-        <w:t>favourable</w:t>
-      </w:r>
-      <w:r>
-        <w:rPr>
-          <w:rFonts w:ascii="Arial" w:hAnsi="Arial" w:cs="Arial"/>
-        </w:rPr>
-        <w:t xml:space="preserve"> outcomes for complex mixed noise and higher intensities of noise, demonstrating deep learning techniques as a plausible scaling option to traditional quantum error correction codes.</w:t>
+        <w:t>This work demonstrates the effectiveness of CNN-based quantum error correction in density matrix reconstruction. Our model provides high fidelity improvements on various types of noise and intensities, with extremely favourable outcomes for complex mixed noise and higher intensities of noise, demonstrating deep learning techniques as a plausible scaling option to traditional quantum error correction codes.</w:t>
       </w:r>
     </w:p>
     <w:p>
@@ -3406,20 +3208,27 @@
         </w:rPr>
         <w:t xml:space="preserve">1. </w:t>
       </w:r>
-      <w:proofErr w:type="spellStart"/>
-      <w:r>
-        <w:rPr>
-          <w:rFonts w:ascii="Arial" w:hAnsi="Arial" w:cs="Arial"/>
-        </w:rPr>
-        <w:t>Github</w:t>
-      </w:r>
-      <w:proofErr w:type="spellEnd"/>
+      <w:r>
+        <w:rPr>
+          <w:rFonts w:ascii="Arial" w:hAnsi="Arial" w:cs="Arial"/>
+        </w:rPr>
+        <w:t>GitHub</w:t>
+      </w:r>
       <w:r>
         <w:rPr>
           <w:rFonts w:ascii="Arial" w:hAnsi="Arial" w:cs="Arial"/>
         </w:rPr>
         <w:t xml:space="preserve"> repository link: </w:t>
       </w:r>
+      <w:hyperlink r:id="rId23" w:history="1">
+        <w:r>
+          <w:rPr>
+            <w:rStyle w:val="Hyperlink"/>
+            <w:rFonts w:ascii="Arial" w:hAnsi="Arial" w:cs="Arial"/>
+          </w:rPr>
+          <w:t>https://github.com/KaranKendre11/MLforQuantumNoiseReduction/tree/main</w:t>
+        </w:r>
+      </w:hyperlink>
     </w:p>
     <w:sectPr>
       <w:pgSz w:w="11906" w:h="16838"/>
@@ -4858,6 +4667,7 @@
   <w:style w:type="character" w:default="1" w:styleId="DefaultParagraphFont">
     <w:name w:val="Default Paragraph Font"/>
     <w:uiPriority w:val="1"/>
+    <w:semiHidden/>
     <w:unhideWhenUsed/>
   </w:style>
   <w:style w:type="table" w:default="1" w:styleId="TableNormal">

</xml_diff>